<commit_message>
Compact stage list controls
</commit_message>
<xml_diff>
--- a/docs/PRD.docx
+++ b/docs/PRD.docx
@@ -652,6 +652,48 @@
           </w:p>
         </w:tc>
       </w:tr>
+      <w:tr>
+        <w:tc>
+          <w:tcPr>
+            <w:tcW w:type="dxa" w:w="1110"/>
+          </w:tcPr>
+          <w:p>
+            <w:r>
+              <w:t>V1.3</w:t>
+            </w:r>
+          </w:p>
+        </w:tc>
+        <w:tc>
+          <w:tcPr>
+            <w:tcW w:type="dxa" w:w="1650"/>
+          </w:tcPr>
+          <w:p>
+            <w:r>
+              <w:t>2026-04-29</w:t>
+            </w:r>
+          </w:p>
+        </w:tc>
+        <w:tc>
+          <w:tcPr>
+            <w:tcW w:type="dxa" w:w="3870"/>
+          </w:tcPr>
+          <w:p>
+            <w:r>
+              <w:t>缩小流程环节列表字体和控件尺寸，降低视觉密度，提升桌面端长列表浏览舒适度</w:t>
+            </w:r>
+          </w:p>
+        </w:tc>
+        <w:tc>
+          <w:tcPr>
+            <w:tcW w:type="dxa" w:w="1650"/>
+          </w:tcPr>
+          <w:p>
+            <w:r>
+              <w:t>Codex</w:t>
+            </w:r>
+          </w:p>
+        </w:tc>
+      </w:tr>
     </w:tbl>
     <w:p>
       <w:pPr>
@@ -13697,6 +13739,26 @@
           <w:sz w:val="21"/>
         </w:rPr>
         <w:t>• 引导版本键更新为 schedule_tool_guide_shown_v2，已完成旧版引导的用户会重新看到新版引导，便于感知交互变化。</w:t>
+      </w:r>
+    </w:p>
+    <w:p>
+      <w:r>
+        <w:t>11.3 流程环节列表视觉密度调整</w:t>
+      </w:r>
+    </w:p>
+    <w:p>
+      <w:r>
+        <w:t>• 流程环节列表整体缩小一个视觉号：环节名称输入框、工期输入组、启停用开关、排序圆点、拖拽把手和删除按钮均下调字号或控件尺寸。</w:t>
+      </w:r>
+    </w:p>
+    <w:p>
+      <w:r>
+        <w:t>• 该调整优先面向 PC/Mac 桌面端，目标是在保留可点按性的前提下，让单屏可浏览的流程阶段更多，减少偏大的表单控件带来的压迫感。</w:t>
+      </w:r>
+    </w:p>
+    <w:p>
+      <w:r>
+        <w:t>• CSS 缓存版本更新为 style.css?v=11，确保线上部署后浏览器能拉取最新样式。</w:t>
       </w:r>
     </w:p>
     <w:p>

</xml_diff>

<commit_message>
Align desktop split-pane layout
</commit_message>
<xml_diff>
--- a/docs/PRD.docx
+++ b/docs/PRD.docx
@@ -694,6 +694,48 @@
           </w:p>
         </w:tc>
       </w:tr>
+      <w:tr>
+        <w:tc>
+          <w:tcPr>
+            <w:tcW w:type="dxa" w:w="1110"/>
+          </w:tcPr>
+          <w:p>
+            <w:r>
+              <w:t>V1.4</w:t>
+            </w:r>
+          </w:p>
+        </w:tc>
+        <w:tc>
+          <w:tcPr>
+            <w:tcW w:type="dxa" w:w="1650"/>
+          </w:tcPr>
+          <w:p>
+            <w:r>
+              <w:t>2026-04-29</w:t>
+            </w:r>
+          </w:p>
+        </w:tc>
+        <w:tc>
+          <w:tcPr>
+            <w:tcW w:type="dxa" w:w="3870"/>
+          </w:tcPr>
+          <w:p>
+            <w:r>
+              <w:t>优化 PC/Mac 桌面布局策略：左右栏统一视口高度并各自滚动，解决倒排对比展开后左侧留白问题</w:t>
+            </w:r>
+          </w:p>
+        </w:tc>
+        <w:tc>
+          <w:tcPr>
+            <w:tcW w:type="dxa" w:w="1650"/>
+          </w:tcPr>
+          <w:p>
+            <w:r>
+              <w:t>Codex</w:t>
+            </w:r>
+          </w:p>
+        </w:tc>
+      </w:tr>
     </w:tbl>
     <w:p>
       <w:pPr>
@@ -13759,6 +13801,36 @@
     <w:p>
       <w:r>
         <w:t>• CSS 缓存版本更新为 style.css?v=11，确保线上部署后浏览器能拉取最新样式。</w:t>
+      </w:r>
+    </w:p>
+    <w:p>
+      <w:r>
+        <w:t>11.4 PC/Mac 桌面布局对齐策略</w:t>
+      </w:r>
+    </w:p>
+    <w:p>
+      <w:r>
+        <w:t>• 桌面端改为固定视口高度的双栏应用壳：顶部标题独立占位，主工作区占满剩余可视高度。</w:t>
+      </w:r>
+    </w:p>
+    <w:p>
+      <w:r>
+        <w:t>• 左侧输入配置与右侧排期结果保持同高，并分别使用内部滚动，避免右侧结果增加时左侧底部出现大面积空白。</w:t>
+      </w:r>
+    </w:p>
+    <w:p>
+      <w:r>
+        <w:t>• 勾选“显示倒排对比结果”后，新增的对比汇总、明细和甘特图在右侧结果栏内部滚动，不再撑高整页。</w:t>
+      </w:r>
+    </w:p>
+    <w:p>
+      <w:r>
+        <w:t>• 1180px 以下继续使用上下堆叠布局和页面级滚动，保留此前的窄屏适配策略。</w:t>
+      </w:r>
+    </w:p>
+    <w:p>
+      <w:r>
+        <w:t>• 本次回归测试覆盖正推、倒推、额外预留、节假日顺延和 SS 高级依赖，结果均符合预期。</w:t>
       </w:r>
     </w:p>
     <w:p>

</xml_diff>

<commit_message>
Sync managed stage name renames
</commit_message>
<xml_diff>
--- a/docs/PRD.docx
+++ b/docs/PRD.docx
@@ -736,6 +736,48 @@
           </w:p>
         </w:tc>
       </w:tr>
+      <w:tr>
+        <w:tc>
+          <w:tcPr>
+            <w:tcW w:type="dxa" w:w="1110"/>
+          </w:tcPr>
+          <w:p>
+            <w:r>
+              <w:t>V1.5</w:t>
+            </w:r>
+          </w:p>
+        </w:tc>
+        <w:tc>
+          <w:tcPr>
+            <w:tcW w:type="dxa" w:w="1650"/>
+          </w:tcPr>
+          <w:p>
+            <w:r>
+              <w:t>2026-04-29</w:t>
+            </w:r>
+          </w:p>
+        </w:tc>
+        <w:tc>
+          <w:tcPr>
+            <w:tcW w:type="dxa" w:w="3870"/>
+          </w:tcPr>
+          <w:p>
+            <w:r>
+              <w:t>修复管理环节名称选项改名不同步问题：候选项改名后同步当前流程、依赖、结果表、甘特图和新增环节下拉</w:t>
+            </w:r>
+          </w:p>
+        </w:tc>
+        <w:tc>
+          <w:tcPr>
+            <w:tcW w:type="dxa" w:w="1650"/>
+          </w:tcPr>
+          <w:p>
+            <w:r>
+              <w:t>Codex</w:t>
+            </w:r>
+          </w:p>
+        </w:tc>
+      </w:tr>
     </w:tbl>
     <w:p>
       <w:pPr>
@@ -13831,6 +13873,31 @@
     <w:p>
       <w:r>
         <w:t>• 本次回归测试覆盖正推、倒推、额外预留、节假日顺延和 SS 高级依赖，结果均符合预期。</w:t>
+      </w:r>
+    </w:p>
+    <w:p>
+      <w:r>
+        <w:t>11.5 环节名称管理同步规则</w:t>
+      </w:r>
+    </w:p>
+    <w:p>
+      <w:r>
+        <w:t>• 在“管理环节名称选项”中修改候选名称时，如果当前流程中存在同名环节，需同步更新流程环节列表、流程依赖关系、时间明细表和甘特图。</w:t>
+      </w:r>
+    </w:p>
+    <w:p>
+      <w:r>
+        <w:t>• 默认候选项被重命名后，新增环节弹窗和环节卡片下拉应显示重命名后的名称，不再同时出现旧默认名称和新自定义名称。</w:t>
+      </w:r>
+    </w:p>
+    <w:p>
+      <w:r>
+        <w:t>• 名称映射需写入本地存储，并随工作区、模板和保存记录一起保留，保证刷新、保存和加载后表现一致。</w:t>
+      </w:r>
+    </w:p>
+    <w:p>
+      <w:r>
+        <w:t>• 本次回归测试覆盖管理改名同步、结果重算、新增弹窗下拉刷新和页面刷新后的映射持久化。</w:t>
       </w:r>
     </w:p>
     <w:p>

</xml_diff>

<commit_message>
Clarify dependency relationship creation
</commit_message>
<xml_diff>
--- a/docs/PRD.docx
+++ b/docs/PRD.docx
@@ -778,6 +778,48 @@
           </w:p>
         </w:tc>
       </w:tr>
+      <w:tr>
+        <w:tc>
+          <w:tcPr>
+            <w:tcW w:type="dxa" w:w="1110"/>
+          </w:tcPr>
+          <w:p>
+            <w:r>
+              <w:t>V1.6</w:t>
+            </w:r>
+          </w:p>
+        </w:tc>
+        <w:tc>
+          <w:tcPr>
+            <w:tcW w:type="dxa" w:w="1650"/>
+          </w:tcPr>
+          <w:p>
+            <w:r>
+              <w:t>2026-04-29</w:t>
+            </w:r>
+          </w:p>
+        </w:tc>
+        <w:tc>
+          <w:tcPr>
+            <w:tcW w:type="dxa" w:w="3870"/>
+          </w:tcPr>
+          <w:p>
+            <w:r>
+              <w:t>优化流程依赖关系交互：按钮文案改为添加关系，新增时自动寻找可用依赖，避免重复依赖提示难理解</w:t>
+            </w:r>
+          </w:p>
+        </w:tc>
+        <w:tc>
+          <w:tcPr>
+            <w:tcW w:type="dxa" w:w="1650"/>
+          </w:tcPr>
+          <w:p>
+            <w:r>
+              <w:t>Codex</w:t>
+            </w:r>
+          </w:p>
+        </w:tc>
+      </w:tr>
     </w:tbl>
     <w:p>
       <w:pPr>
@@ -13898,6 +13940,31 @@
     <w:p>
       <w:r>
         <w:t>• 本次回归测试覆盖管理改名同步、结果重算、新增弹窗下拉刷新和页面刷新后的映射持久化。</w:t>
+      </w:r>
+    </w:p>
+    <w:p>
+      <w:r>
+        <w:t>11.6 流程依赖关系交互说明</w:t>
+      </w:r>
+    </w:p>
+    <w:p>
+      <w:r>
+        <w:t>• 将“添加依赖”文案调整为“添加关系”，强调该操作新增的是两个环节之间的先后关系，而不是新增流程环节。</w:t>
+      </w:r>
+    </w:p>
+    <w:p>
+      <w:r>
+        <w:t>• 依赖关系说明文案改为“左侧环节会影响右侧环节”，默认含义为做完 A 再做 B。</w:t>
+      </w:r>
+    </w:p>
+    <w:p>
+      <w:r>
+        <w:t>• 点击“添加关系”时自动寻找当前尚未存在且不会形成循环的依赖关系，优先补齐相邻环节关系，避免重复添加第一组关系。</w:t>
+      </w:r>
+    </w:p>
+    <w:p>
+      <w:r>
+        <w:t>• 当所有可自动添加的关系都已存在时，提示用户编辑已有依赖或删除后调整。</w:t>
       </w:r>
     </w:p>
     <w:p>

</xml_diff>

<commit_message>
Add clear configuration action
</commit_message>
<xml_diff>
--- a/docs/PRD.docx
+++ b/docs/PRD.docx
@@ -73,17 +73,8 @@
             </w:tcMar>
           </w:tcPr>
           <w:p>
-            <w:pPr>
-              <w:spacing w:before="120" w:after="120" w:line="288" w:lineRule="auto"/>
-              <w:ind w:left="0"/>
-              <w:jc w:val="left"/>
-            </w:pPr>
-            <w:r>
-              <w:rPr>
-                <w:rFonts w:eastAsia="等线" w:ascii="Arial" w:cs="Arial" w:hAnsi="Arial"/>
-                <w:sz w:val="22"/>
-              </w:rPr>
-              <w:t>V1.0</w:t>
+            <w:r>
+              <w:t>V1.7</w:t>
             </w:r>
           </w:p>
         </w:tc>
@@ -181,17 +172,8 @@
             </w:tcMar>
           </w:tcPr>
           <w:p>
-            <w:pPr>
-              <w:spacing w:before="120" w:after="120" w:line="288" w:lineRule="auto"/>
-              <w:ind w:left="0"/>
-              <w:jc w:val="left"/>
-            </w:pPr>
-            <w:r>
-              <w:rPr>
-                <w:rFonts w:eastAsia="等线" w:ascii="Arial" w:cs="Arial" w:hAnsi="Arial"/>
-                <w:sz w:val="22"/>
-              </w:rPr>
-              <w:t>初版发布</w:t>
+            <w:r>
+              <w:t>持续迭代中</w:t>
             </w:r>
           </w:p>
         </w:tc>
@@ -820,6 +802,48 @@
           </w:p>
         </w:tc>
       </w:tr>
+      <w:tr>
+        <w:tc>
+          <w:tcPr>
+            <w:tcW w:type="dxa" w:w="1110"/>
+          </w:tcPr>
+          <w:p>
+            <w:r>
+              <w:t>V1.7</w:t>
+            </w:r>
+          </w:p>
+        </w:tc>
+        <w:tc>
+          <w:tcPr>
+            <w:tcW w:type="dxa" w:w="1650"/>
+          </w:tcPr>
+          <w:p>
+            <w:r>
+              <w:t>2026-04-30</w:t>
+            </w:r>
+          </w:p>
+        </w:tc>
+        <w:tc>
+          <w:tcPr>
+            <w:tcW w:type="dxa" w:w="3870"/>
+          </w:tcPr>
+          <w:p>
+            <w:r>
+              <w:t>新增“清空配置”功能：一键重置当前输入配置和结果，保留保存记录、模板与环节名称资产</w:t>
+            </w:r>
+          </w:p>
+        </w:tc>
+        <w:tc>
+          <w:tcPr>
+            <w:tcW w:type="dxa" w:w="1650"/>
+          </w:tcPr>
+          <w:p>
+            <w:r>
+              <w:t>Codex</w:t>
+            </w:r>
+          </w:p>
+        </w:tc>
+      </w:tr>
     </w:tbl>
     <w:p>
       <w:pPr>
@@ -13965,6 +13989,46 @@
     <w:p>
       <w:r>
         <w:t>• 当所有可自动添加的关系都已存在时，提示用户编辑已有依赖或删除后调整。</w:t>
+      </w:r>
+    </w:p>
+    <w:p>
+      <w:r>
+        <w:t>11.7 清空配置功能范围</w:t>
+      </w:r>
+    </w:p>
+    <w:p>
+      <w:r>
+        <w:t>• 输入配置区新增“清空配置”按钮，用于快速开始新的排期需求，避免逐项手动删除或重填。</w:t>
+      </w:r>
+    </w:p>
+    <w:p>
+      <w:r>
+        <w:t>• 清空范围包括：排期方式重置为正推、需求开始日期清空、期望结束日期清空、额外预留天数重置为 0、工作日规则重置为“双休 + 中国法定节假日”。</w:t>
+      </w:r>
+    </w:p>
+    <w:p>
+      <w:r>
+        <w:t>• 流程环节重置为默认 6 个环节，工期置空并保持启用状态；若默认环节名称已在“管理环节名称选项”中改名，重置后继续使用改名后的名称。</w:t>
+      </w:r>
+    </w:p>
+    <w:p>
+      <w:r>
+        <w:t>• 流程依赖关系重置为默认相邻环节尾→首关系，间隔为 0 天；高级依赖、临时新增关系和当前查看记录状态同步清除。</w:t>
+      </w:r>
+    </w:p>
+    <w:p>
+      <w:r>
+        <w:t>• 右侧项目汇总、时间明细表、甘特图恢复为空态提示；同时删除自动保存的当前工作区快照，强制刷新后不再恢复旧输入。</w:t>
+      </w:r>
+    </w:p>
+    <w:p>
+      <w:r>
+        <w:t>• 清空操作不删除已保存的排期记录、标效模板、管理环节名称选项、环节名称映射和新手引导状态。</w:t>
+      </w:r>
+    </w:p>
+    <w:p>
+      <w:r>
+        <w:t>• 操作前弹出确认提示，避免误清空当前正在编辑的输入配置。</w:t>
       </w:r>
     </w:p>
     <w:p>

</xml_diff>